<commit_message>
feat: record O-16/O-17/O-18 decisions and use local day in calendar
O-16: controlled-live may run without a News Center (accepted risk,
NEWS_UNAVAILABLE_ACCEPTED). O-17: MARKET plus BUY/SELL LIMIT and STOP
on any selected symbol the setup engine and Risk Kernel approve;
pending orders still require REQ-021 integration. O-18: dashboard
and calendar use the terminal's local day while FTMO rules keep
Europe/Prague. New open items: O-19 (S02 definition), O-04 (risk
and exposure limits).

Calendar and today P/L now bucket deals by local day. 308 tests pass;
MetaEditor 0 errors, 0 warnings.

Co-Authored-By: Claude Opus 5.5 <noreply@anthropic.com>
</commit_message>
<xml_diff>
--- a/Dac_ta_tong_the_EA_MT5_MCP_AI_News_Dashboard_v1_4.docx
+++ b/Dac_ta_tong_the_EA_MT5_MCP_AI_News_Dashboard_v1_4.docx
@@ -29567,7 +29567,7 @@
     </w:p>
     <w:p>
       <w:r>
-        <w:t>Phase 11 không được AUTHORIZED trước khi đạt tối thiểu: Phase 1 hoàn tất; Phase 2 cho đúng các symbol và setup trong phạm vi được phép; gate Phase 3 (TC-009, TC-010, TC-031 đến TC-037) chạy trên broker spec mục tiêu; phần quản lý vị thế của Phase 4 cho phạm vi được phép; Phase 5 hiển thị policy, floor và headroom lấy từ Risk Kernel; toàn bộ PRE-01 đến PRE-10. Phase 6 đến 8 (News Center, MCP AI) chỉ được miễn làm điều kiện tiên quyết khi người dùng chốt O-16. AI không bắt buộc cho live đầu tiên vì quyền tối đa mặc định là Level 0/1 (LIVE-04).</w:t>
+        <w:t>Phase 11 không được AUTHORIZED trước khi đạt tối thiểu: Phase 1 hoàn tất; Phase 2 cho đúng các symbol và setup trong phạm vi được phép; gate Phase 3 (TC-009, TC-010, TC-031 đến TC-037) chạy trên broker spec mục tiêu; phần quản lý vị thế của Phase 4 cho phạm vi được phép; Phase 5 hiển thị policy, floor và headroom lấy từ Risk Kernel; toàn bộ PRE-01 đến PRE-10. Theo O-16 đã chốt (D.4), Phase 6 đến 8 (News Center, MCP AI) không phải điều kiện tiên quyết của controlled-live. AI không bắt buộc cho live đầu tiên vì quyền tối đa mặc định là Level 0/1 (LIVE-04).</w:t>
       </w:r>
     </w:p>
     <w:p>
@@ -29575,22 +29575,32 @@
         <w:pStyle w:val="Heading2"/>
       </w:pPr>
       <w:r>
-        <w:t>D.4 Quyết định mở bổ sung</w:t>
-      </w:r>
-    </w:p>
-    <w:p>
-      <w:r>
-        <w:t>O-16: Có cho phép controlled-live khi News Center chưa xây không? Nếu có, chính sách cho trạng thái NEWS_UNKNOWN là gì? Đề xuất mặc định: NEWS_UNKNOWN = BLOCK_NEW_ENTRY theo mục 7.4, nghĩa là controlled-live phải chờ Phase 6 hoặc một lịch tin thủ công được operator nhập và duyệt. Ảnh hưởng: LIVE-05, Phase 6/11. Deadline: trước manual authorization.</w:t>
-      </w:r>
-    </w:p>
-    <w:p>
-      <w:r>
-        <w:t>O-17: Phạm vi controlled-live đầu tiên: market-only, danh sách symbol, setup S02, risk mỗi trade và tổng exposure tối đa. Ảnh hưởng: cổng 3 và 4 tại D.2. Deadline: trước manual authorization.</w:t>
-      </w:r>
-    </w:p>
-    <w:p>
-      <w:r>
-        <w:t>O-18: Ngày giao dịch cho Dashboard/Calendar dùng 00:00 Europe/Prague (theo FTMO) hay giờ khác? Đây là phần cụ thể hóa O-03 cho DailyStats; khi chưa chốt, Calendar chỉ hiển thị realized P/L theo ngày UTC và không hiển thị chế độ phần trăm hoặc R.</w:t>
+        <w:t>D.4 Quyết định người dùng ngày 03/10/2026</w:t>
+      </w:r>
+    </w:p>
+    <w:p>
+      <w:r>
+        <w:t>O-16 CONFIRMED: controlled-live được phép chạy khi News Center chưa xây. Trạng thái tin hiển thị là NEWS_UNAVAILABLE_ACCEPTED, không phải NORMAL; LIVE-05 được thỏa bằng chấp thuận này và phải ghi vào live authorization (news_policy_confirmed). Hệ quả được chấp nhận: EA không tự chặn entry quanh tin high impact và không tự kiểm soát spread hoặc trượt giá do tin. Nếu loại tài khoản FTMO đang dùng có giới hạn giao dịch quanh tin, EA chưa thể tự tuân thủ giới hạn đó khi chưa có News Center; operator chịu trách nhiệm cho tới Phase 6.</w:t>
+      </w:r>
+    </w:p>
+    <w:p>
+      <w:r>
+        <w:t>O-17 PARTIAL: loại lệnh trong phạm vi là MARKET, BUY/SELL LIMIT và BUY/SELL STOP; STOP LIMIT vẫn ngoài phạm vi. Symbol: mọi symbol đã chọn và resolve, chỉ khi setup engine tạo candidate hợp lệ và Risk Kernel duyệt. Hệ quả: lệnh LIMIT/STOP cần hoàn tất REQ-021 (TC-046 đến TC-051) và tích hợp pending vào execution adapter trước khi được cấp phép; hiện adapter từ chối cứng pending. Còn mở: O-19 và O-04.</w:t>
+      </w:r>
+    </w:p>
+    <w:p>
+      <w:r>
+        <w:t>O-19 OPEN: định nghĩa S02 dùng cho live. Runtime hiện tại lấy key level là đỉnh/đáy của 20 nến M5 đóng gần nhất, ATR14, tham số research seed chưa tối ưu. Theo mục 2 và 4.4, key level phải là location có ý nghĩa (PDH/PDL, đỉnh đáy phiên, swing, vùng S/R); cần chốt nguồn level, timeframe, profile SCALP/SWING và ngưỡng trước Phase 2 cho S02.</w:t>
+      </w:r>
+    </w:p>
+    <w:p>
+      <w:r>
+        <w:t>O-04 OPEN (nhắc lại): mức risk chính thức. Các con số trong mục 5.3 (0,50% mỗi lệnh, 2,00% tổng open risk, USD 1,25%, EUR 1,00%, tối đa 2 lệnh tương quan, lỗ ngày 2%, tuần 4%) mới là seed PROPOSED; sàn FTMO ở phụ lục B là giới hạn cứng. Chưa có giá trị nào được người dùng duyệt, và exposure theo đồng tiền (mục 5.5) chưa được triển khai.</w:t>
+      </w:r>
+    </w:p>
+    <w:p>
+      <w:r>
+        <w:t>O-18 CONFIRMED: Dashboard và Calendar tính ngày theo giờ địa phương của máy chạy terminal (hiện GMT+7). Mọi quy tắc FTMO, gồm daily reset, DailyFloor và OverallFloor, vẫn theo Europe/Prague CE(S)T như phụ lục B. Hai mốc ngày được hiển thị tách biệt và không dùng lẫn cho quyết định risk.</w:t>
       </w:r>
     </w:p>
     <w:p>

</xml_diff>

<commit_message>
feat: S02 v1 risk path with structural SL/TP, costs and O-04 limits
S02 v1 candidates now resolve a full trade plan without manual inputs:
SL beyond the retest extreme plus max(0.10 ATR, 1.5 spread), TP at the
nearest structural level at least 1R away (none: NO_STRUCTURAL_TARGET),
spread capped at 2x the M5 median and 25% of the stop, round-trip
commission learned per symbol plus expected SWING swap, net RR >= 1.5
SCALP / 2.0 SWING, O-04 per-trade, total-open and currency limits with
the HTF modifier, margin level >= 300%, and FTMO floors from the risk
ledger (current Prague reset required). The prototype keeps its input
plan; both share the same Risk Kernel checks. Execution still needs
every controlled-live gate.

Specs: one-week forward run by the operator as the validation step, and
appendix D.7 lists what is restored on re-attach.

349 tests pass (1 skipped: tzdata); MetaEditor 0 errors, 0 warnings.

Co-Authored-By: Claude Opus 5.5 <noreply@anthropic.com>
</commit_message>
<xml_diff>
--- a/Dac_ta_tong_the_EA_MT5_MCP_AI_News_Dashboard_v1_4.docx
+++ b/Dac_ta_tong_the_EA_MT5_MCP_AI_News_Dashboard_v1_4.docx
@@ -29627,6 +29627,19 @@
     <w:p>
       <w:r>
         <w:t>Phase 0: một phần; O-01 và một phần O-02 đã có bằng chứng, các quyết định còn lại mở. Phase 1: gần hoàn tất; chưa có load và validate config ngoài trong MQL5. Phase 2: khoảng 25%; runtime evidence đa symbol đã chạy trên MT5, S02 có runtime nhưng tắt mặc định; chưa có regime, session, levels, S01 và S03 đến S06, replay. Phase 3: khoảng 60% ở mức offline; chưa có currency exposure và correlation (mục 5.5, TC-008), TC-031 đến TC-037 chưa chạy trên broker. Phase 4: khoảng 20%; ExpectedPath và pending lifecycle mới ở mức offline. Phase 5: khoảng 40% sau khi tách Dashboard và Settings; chưa có Command Queue, DailyStats theo rollover, chế độ phần trăm và R. Phase 6 đến 8: chưa bắt đầu. Phase 10: chưa bắt đầu. Phase 11: execution adapter, các cổng và controlled-live runtime đã có trên nhánh controlled-live; bản đo readiness ngày 03/10/2026 là NOT_READY. Trạng thái tổng: NOT_AUTHORIZED.</w:t>
+      </w:r>
+    </w:p>
+    <w:p>
+      <w:pPr>
+        <w:pStyle w:val="Heading2"/>
+      </w:pPr>
+      <w:r>
+        <w:t>D.7 Khôi phục khi gỡ và gắn lại EA</w:t>
+      </w:r>
+    </w:p>
+    <w:p>
+      <w:r>
+        <w:t>Yêu cầu người dùng ngày 03/10/2026: mọi dữ liệu EA đã sinh ra và lưu theo logic phải được nạp lại khi EA bị gỡ rồi gắn lại. Positions, orders và deals luôn đọc lại từ broker ở mỗi lần refresh. Các dữ liệu sau được lưu nguyên tử trong thư mục current và khôi phục khi khởi động, chỉ khi cùng config version, account fingerprint và broker server: danh sách symbol đã Apply (symbol_selection.json, thay cho InpCanonicalSymbols); policy, xác nhận và thời điểm authorization (policy_settings.json); trạng thái engine S02 theo từng symbol và profile (strategy_&lt;symbol&gt;_&lt;khung&gt;.json, hiệu lực 7 ngày, chạy bù các nến bị lỡ tối đa 24 giờ với SCALP và 5 ngày với SWING, quá thì về IDLE); thống kê realized theo ngày cho Calendar (daily_stats.json, tích lũy vượt cửa sổ lịch sử broker); ledger FTMO gồm vốn ban đầu, balance tại reset Prague gần nhất và high-water 1-Step (risk_ledger.json); trạng thái controller, recovery của lệnh và audit; giao diện panel (ui_state.json). File thiếu, hỏng hoặc khác danh tính thì không dùng: dữ liệu tính lại từ broker hoặc engine bắt đầu IDLE; không bao giờ mở khóa entry vì khôi phục.</w:t>
       </w:r>
     </w:p>
     <w:p/>

</xml_diff>